<commit_message>
Adding Laravel Octane notes
</commit_message>
<xml_diff>
--- a/Laravel/Laravel-notes-from-docs/Laravel-Notes-02.docx
+++ b/Laravel/Laravel-notes-from-docs/Laravel-Notes-02.docx
@@ -854,6 +854,7 @@
       <w:r>
         <w:rPr>
           <w:rFonts w:ascii="Sakkal Majalla" w:hAnsi="Sakkal Majalla" w:cs="Sakkal Majalla"/>
+          <w:noProof/>
           <w:sz w:val="28"/>
           <w:szCs w:val="28"/>
         </w:rPr>
@@ -923,6 +924,7 @@
       <w:r>
         <w:rPr>
           <w:rFonts w:ascii="Sakkal Majalla" w:hAnsi="Sakkal Majalla" w:cs="Sakkal Majalla"/>
+          <w:noProof/>
           <w:sz w:val="28"/>
           <w:szCs w:val="28"/>
         </w:rPr>
@@ -1125,6 +1127,7 @@
       <w:r>
         <w:rPr>
           <w:rFonts w:ascii="Sakkal Majalla" w:hAnsi="Sakkal Majalla" w:cs="Sakkal Majalla"/>
+          <w:noProof/>
           <w:sz w:val="28"/>
           <w:szCs w:val="28"/>
         </w:rPr>
@@ -1195,6 +1198,7 @@
       <w:r>
         <w:rPr>
           <w:rFonts w:ascii="Sakkal Majalla" w:hAnsi="Sakkal Majalla" w:cs="Sakkal Majalla"/>
+          <w:noProof/>
           <w:sz w:val="28"/>
           <w:szCs w:val="28"/>
         </w:rPr>
@@ -1574,6 +1578,7 @@
       <w:r>
         <w:rPr>
           <w:rFonts w:ascii="Sakkal Majalla" w:hAnsi="Sakkal Majalla" w:cs="Sakkal Majalla"/>
+          <w:noProof/>
           <w:sz w:val="28"/>
           <w:szCs w:val="28"/>
         </w:rPr>
@@ -1631,6 +1636,888 @@
         </w:rPr>
         <w:t>*********************************************************</w:t>
       </w:r>
+    </w:p>
+    <w:p>
+      <w:pPr>
+        <w:rPr>
+          <w:rFonts w:ascii="Sakkal Majalla" w:hAnsi="Sakkal Majalla" w:cs="Sakkal Majalla"/>
+          <w:sz w:val="28"/>
+          <w:szCs w:val="28"/>
+        </w:rPr>
+      </w:pPr>
+      <w:r>
+        <w:rPr>
+          <w:rFonts w:ascii="Sakkal Majalla" w:hAnsi="Sakkal Majalla" w:cs="Sakkal Majalla"/>
+          <w:sz w:val="28"/>
+          <w:szCs w:val="28"/>
+        </w:rPr>
+        <w:lastRenderedPageBreak/>
+        <w:t xml:space="preserve">Here we have different results when running the application using: </w:t>
+      </w:r>
+      <w:proofErr w:type="gramStart"/>
+      <w:r>
+        <w:rPr>
+          <w:rFonts w:ascii="Sakkal Majalla" w:hAnsi="Sakkal Majalla" w:cs="Sakkal Majalla"/>
+          <w:b/>
+          <w:bCs/>
+          <w:color w:val="8DD873" w:themeColor="accent6" w:themeTint="99"/>
+          <w:sz w:val="28"/>
+          <w:szCs w:val="28"/>
+        </w:rPr>
+        <w:t>octane:start</w:t>
+      </w:r>
+      <w:proofErr w:type="gramEnd"/>
+      <w:r>
+        <w:rPr>
+          <w:rFonts w:ascii="Sakkal Majalla" w:hAnsi="Sakkal Majalla" w:cs="Sakkal Majalla"/>
+          <w:color w:val="8DD873" w:themeColor="accent6" w:themeTint="99"/>
+          <w:sz w:val="28"/>
+          <w:szCs w:val="28"/>
+        </w:rPr>
+        <w:t xml:space="preserve"> </w:t>
+      </w:r>
+      <w:r>
+        <w:rPr>
+          <w:rFonts w:ascii="Sakkal Majalla" w:hAnsi="Sakkal Majalla" w:cs="Sakkal Majalla"/>
+          <w:sz w:val="28"/>
+          <w:szCs w:val="28"/>
+        </w:rPr>
+        <w:t xml:space="preserve">OR </w:t>
+      </w:r>
+      <w:r>
+        <w:rPr>
+          <w:rFonts w:ascii="Sakkal Majalla" w:hAnsi="Sakkal Majalla" w:cs="Sakkal Majalla"/>
+          <w:b/>
+          <w:bCs/>
+          <w:color w:val="8DD873" w:themeColor="accent6" w:themeTint="99"/>
+          <w:sz w:val="28"/>
+          <w:szCs w:val="28"/>
+        </w:rPr>
+        <w:t>artisan serve</w:t>
+      </w:r>
+    </w:p>
+    <w:p>
+      <w:pPr>
+        <w:shd w:val="clear" w:color="auto" w:fill="FFFFFF"/>
+        <w:spacing w:after="0" w:line="285" w:lineRule="atLeast"/>
+        <w:rPr>
+          <w:rFonts w:ascii="Consolas" w:eastAsia="Times New Roman" w:hAnsi="Consolas" w:cs="Times New Roman"/>
+          <w:color w:val="3B3B3B"/>
+          <w:kern w:val="0"/>
+          <w:sz w:val="21"/>
+          <w:szCs w:val="21"/>
+          <w14:ligatures w14:val="none"/>
+        </w:rPr>
+      </w:pPr>
+      <w:r>
+        <w:rPr>
+          <w:rFonts w:ascii="Consolas" w:eastAsia="Times New Roman" w:hAnsi="Consolas" w:cs="Times New Roman"/>
+          <w:color w:val="001080"/>
+          <w:kern w:val="0"/>
+          <w:sz w:val="21"/>
+          <w:szCs w:val="21"/>
+          <w14:ligatures w14:val="none"/>
+        </w:rPr>
+        <w:t>$myStartTime</w:t>
+      </w:r>
+      <w:r>
+        <w:rPr>
+          <w:rFonts w:ascii="Consolas" w:eastAsia="Times New Roman" w:hAnsi="Consolas" w:cs="Times New Roman"/>
+          <w:color w:val="000000"/>
+          <w:kern w:val="0"/>
+          <w:sz w:val="21"/>
+          <w:szCs w:val="21"/>
+          <w14:ligatures w14:val="none"/>
+        </w:rPr>
+        <w:t xml:space="preserve"> = </w:t>
+      </w:r>
+      <w:r>
+        <w:rPr>
+          <w:rFonts w:ascii="Consolas" w:eastAsia="Times New Roman" w:hAnsi="Consolas" w:cs="Times New Roman"/>
+          <w:color w:val="795E26"/>
+          <w:kern w:val="0"/>
+          <w:sz w:val="21"/>
+          <w:szCs w:val="21"/>
+          <w14:ligatures w14:val="none"/>
+        </w:rPr>
+        <w:t>microtime</w:t>
+      </w:r>
+      <w:r>
+        <w:rPr>
+          <w:rFonts w:ascii="Consolas" w:eastAsia="Times New Roman" w:hAnsi="Consolas" w:cs="Times New Roman"/>
+          <w:color w:val="000000"/>
+          <w:kern w:val="0"/>
+          <w:sz w:val="21"/>
+          <w:szCs w:val="21"/>
+          <w14:ligatures w14:val="none"/>
+        </w:rPr>
+        <w:t>(</w:t>
+      </w:r>
+      <w:r>
+        <w:rPr>
+          <w:rFonts w:ascii="Consolas" w:eastAsia="Times New Roman" w:hAnsi="Consolas" w:cs="Times New Roman"/>
+          <w:color w:val="0000FF"/>
+          <w:kern w:val="0"/>
+          <w:sz w:val="21"/>
+          <w:szCs w:val="21"/>
+          <w14:ligatures w14:val="none"/>
+        </w:rPr>
+        <w:t>true</w:t>
+      </w:r>
+      <w:r>
+        <w:rPr>
+          <w:rFonts w:ascii="Consolas" w:eastAsia="Times New Roman" w:hAnsi="Consolas" w:cs="Times New Roman"/>
+          <w:color w:val="000000"/>
+          <w:kern w:val="0"/>
+          <w:sz w:val="21"/>
+          <w:szCs w:val="21"/>
+          <w14:ligatures w14:val="none"/>
+        </w:rPr>
+        <w:t>);</w:t>
+      </w:r>
+    </w:p>
+    <w:p>
+      <w:pPr>
+        <w:shd w:val="clear" w:color="auto" w:fill="FFFFFF"/>
+        <w:spacing w:after="0" w:line="285" w:lineRule="atLeast"/>
+        <w:rPr>
+          <w:rFonts w:ascii="Consolas" w:eastAsia="Times New Roman" w:hAnsi="Consolas" w:cs="Times New Roman"/>
+          <w:color w:val="3B3B3B"/>
+          <w:kern w:val="0"/>
+          <w:sz w:val="21"/>
+          <w:szCs w:val="21"/>
+          <w14:ligatures w14:val="none"/>
+        </w:rPr>
+      </w:pPr>
+      <w:proofErr w:type="gramStart"/>
+      <w:r>
+        <w:rPr>
+          <w:rFonts w:ascii="Consolas" w:eastAsia="Times New Roman" w:hAnsi="Consolas" w:cs="Times New Roman"/>
+          <w:color w:val="267F99"/>
+          <w:kern w:val="0"/>
+          <w:sz w:val="21"/>
+          <w:szCs w:val="21"/>
+          <w14:ligatures w14:val="none"/>
+        </w:rPr>
+        <w:t>Route</w:t>
+      </w:r>
+      <w:r>
+        <w:rPr>
+          <w:rFonts w:ascii="Consolas" w:eastAsia="Times New Roman" w:hAnsi="Consolas" w:cs="Times New Roman"/>
+          <w:color w:val="000000"/>
+          <w:kern w:val="0"/>
+          <w:sz w:val="21"/>
+          <w:szCs w:val="21"/>
+          <w14:ligatures w14:val="none"/>
+        </w:rPr>
+        <w:t>::</w:t>
+      </w:r>
+      <w:r>
+        <w:rPr>
+          <w:rFonts w:ascii="Consolas" w:eastAsia="Times New Roman" w:hAnsi="Consolas" w:cs="Times New Roman"/>
+          <w:color w:val="795E26"/>
+          <w:kern w:val="0"/>
+          <w:sz w:val="21"/>
+          <w:szCs w:val="21"/>
+          <w14:ligatures w14:val="none"/>
+        </w:rPr>
+        <w:t>get</w:t>
+      </w:r>
+      <w:r>
+        <w:rPr>
+          <w:rFonts w:ascii="Consolas" w:eastAsia="Times New Roman" w:hAnsi="Consolas" w:cs="Times New Roman"/>
+          <w:color w:val="000000"/>
+          <w:kern w:val="0"/>
+          <w:sz w:val="21"/>
+          <w:szCs w:val="21"/>
+          <w14:ligatures w14:val="none"/>
+        </w:rPr>
+        <w:t>(</w:t>
+      </w:r>
+      <w:proofErr w:type="gramEnd"/>
+      <w:r>
+        <w:rPr>
+          <w:rFonts w:ascii="Consolas" w:eastAsia="Times New Roman" w:hAnsi="Consolas" w:cs="Times New Roman"/>
+          <w:color w:val="A31515"/>
+          <w:kern w:val="0"/>
+          <w:sz w:val="21"/>
+          <w:szCs w:val="21"/>
+          <w14:ligatures w14:val="none"/>
+        </w:rPr>
+        <w:t>'/'</w:t>
+      </w:r>
+      <w:r>
+        <w:rPr>
+          <w:rFonts w:ascii="Consolas" w:eastAsia="Times New Roman" w:hAnsi="Consolas" w:cs="Times New Roman"/>
+          <w:color w:val="000000"/>
+          <w:kern w:val="0"/>
+          <w:sz w:val="21"/>
+          <w:szCs w:val="21"/>
+          <w14:ligatures w14:val="none"/>
+        </w:rPr>
+        <w:t xml:space="preserve">, </w:t>
+      </w:r>
+      <w:r>
+        <w:rPr>
+          <w:rFonts w:ascii="Consolas" w:eastAsia="Times New Roman" w:hAnsi="Consolas" w:cs="Times New Roman"/>
+          <w:color w:val="0000FF"/>
+          <w:kern w:val="0"/>
+          <w:sz w:val="21"/>
+          <w:szCs w:val="21"/>
+          <w14:ligatures w14:val="none"/>
+        </w:rPr>
+        <w:t>function</w:t>
+      </w:r>
+      <w:r>
+        <w:rPr>
+          <w:rFonts w:ascii="Consolas" w:eastAsia="Times New Roman" w:hAnsi="Consolas" w:cs="Times New Roman"/>
+          <w:color w:val="000000"/>
+          <w:kern w:val="0"/>
+          <w:sz w:val="21"/>
+          <w:szCs w:val="21"/>
+          <w14:ligatures w14:val="none"/>
+        </w:rPr>
+        <w:t xml:space="preserve"> () </w:t>
+      </w:r>
+      <w:r>
+        <w:rPr>
+          <w:rFonts w:ascii="Consolas" w:eastAsia="Times New Roman" w:hAnsi="Consolas" w:cs="Times New Roman"/>
+          <w:color w:val="0000FF"/>
+          <w:kern w:val="0"/>
+          <w:sz w:val="21"/>
+          <w:szCs w:val="21"/>
+          <w14:ligatures w14:val="none"/>
+        </w:rPr>
+        <w:t>use</w:t>
+      </w:r>
+      <w:r>
+        <w:rPr>
+          <w:rFonts w:ascii="Consolas" w:eastAsia="Times New Roman" w:hAnsi="Consolas" w:cs="Times New Roman"/>
+          <w:color w:val="000000"/>
+          <w:kern w:val="0"/>
+          <w:sz w:val="21"/>
+          <w:szCs w:val="21"/>
+          <w14:ligatures w14:val="none"/>
+        </w:rPr>
+        <w:t>(</w:t>
+      </w:r>
+      <w:r>
+        <w:rPr>
+          <w:rFonts w:ascii="Consolas" w:eastAsia="Times New Roman" w:hAnsi="Consolas" w:cs="Times New Roman"/>
+          <w:color w:val="001080"/>
+          <w:kern w:val="0"/>
+          <w:sz w:val="21"/>
+          <w:szCs w:val="21"/>
+          <w14:ligatures w14:val="none"/>
+        </w:rPr>
+        <w:t>$myStartTime</w:t>
+      </w:r>
+      <w:r>
+        <w:rPr>
+          <w:rFonts w:ascii="Consolas" w:eastAsia="Times New Roman" w:hAnsi="Consolas" w:cs="Times New Roman"/>
+          <w:color w:val="000000"/>
+          <w:kern w:val="0"/>
+          <w:sz w:val="21"/>
+          <w:szCs w:val="21"/>
+          <w14:ligatures w14:val="none"/>
+        </w:rPr>
+        <w:t>) {</w:t>
+      </w:r>
+    </w:p>
+    <w:p>
+      <w:pPr>
+        <w:shd w:val="clear" w:color="auto" w:fill="FFFFFF"/>
+        <w:spacing w:after="0" w:line="285" w:lineRule="atLeast"/>
+        <w:rPr>
+          <w:rFonts w:ascii="Consolas" w:eastAsia="Times New Roman" w:hAnsi="Consolas" w:cs="Times New Roman"/>
+          <w:color w:val="3B3B3B"/>
+          <w:kern w:val="0"/>
+          <w:sz w:val="21"/>
+          <w:szCs w:val="21"/>
+          <w14:ligatures w14:val="none"/>
+        </w:rPr>
+      </w:pPr>
+      <w:r>
+        <w:rPr>
+          <w:rFonts w:ascii="Consolas" w:eastAsia="Times New Roman" w:hAnsi="Consolas" w:cs="Times New Roman"/>
+          <w:color w:val="000000"/>
+          <w:kern w:val="0"/>
+          <w:sz w:val="21"/>
+          <w:szCs w:val="21"/>
+          <w14:ligatures w14:val="none"/>
+        </w:rPr>
+        <w:t xml:space="preserve">    </w:t>
+      </w:r>
+      <w:r>
+        <w:rPr>
+          <w:rFonts w:ascii="Consolas" w:eastAsia="Times New Roman" w:hAnsi="Consolas" w:cs="Times New Roman"/>
+          <w:color w:val="001080"/>
+          <w:kern w:val="0"/>
+          <w:sz w:val="21"/>
+          <w:szCs w:val="21"/>
+          <w14:ligatures w14:val="none"/>
+        </w:rPr>
+        <w:t>$myLocalStartTime</w:t>
+      </w:r>
+      <w:r>
+        <w:rPr>
+          <w:rFonts w:ascii="Consolas" w:eastAsia="Times New Roman" w:hAnsi="Consolas" w:cs="Times New Roman"/>
+          <w:color w:val="000000"/>
+          <w:kern w:val="0"/>
+          <w:sz w:val="21"/>
+          <w:szCs w:val="21"/>
+          <w14:ligatures w14:val="none"/>
+        </w:rPr>
+        <w:t xml:space="preserve"> = </w:t>
+      </w:r>
+      <w:r>
+        <w:rPr>
+          <w:rFonts w:ascii="Consolas" w:eastAsia="Times New Roman" w:hAnsi="Consolas" w:cs="Times New Roman"/>
+          <w:color w:val="795E26"/>
+          <w:kern w:val="0"/>
+          <w:sz w:val="21"/>
+          <w:szCs w:val="21"/>
+          <w14:ligatures w14:val="none"/>
+        </w:rPr>
+        <w:t>microtime</w:t>
+      </w:r>
+      <w:r>
+        <w:rPr>
+          <w:rFonts w:ascii="Consolas" w:eastAsia="Times New Roman" w:hAnsi="Consolas" w:cs="Times New Roman"/>
+          <w:color w:val="000000"/>
+          <w:kern w:val="0"/>
+          <w:sz w:val="21"/>
+          <w:szCs w:val="21"/>
+          <w14:ligatures w14:val="none"/>
+        </w:rPr>
+        <w:t>(</w:t>
+      </w:r>
+      <w:r>
+        <w:rPr>
+          <w:rFonts w:ascii="Consolas" w:eastAsia="Times New Roman" w:hAnsi="Consolas" w:cs="Times New Roman"/>
+          <w:color w:val="0000FF"/>
+          <w:kern w:val="0"/>
+          <w:sz w:val="21"/>
+          <w:szCs w:val="21"/>
+          <w14:ligatures w14:val="none"/>
+        </w:rPr>
+        <w:t>true</w:t>
+      </w:r>
+      <w:r>
+        <w:rPr>
+          <w:rFonts w:ascii="Consolas" w:eastAsia="Times New Roman" w:hAnsi="Consolas" w:cs="Times New Roman"/>
+          <w:color w:val="000000"/>
+          <w:kern w:val="0"/>
+          <w:sz w:val="21"/>
+          <w:szCs w:val="21"/>
+          <w14:ligatures w14:val="none"/>
+        </w:rPr>
+        <w:t>);</w:t>
+      </w:r>
+    </w:p>
+    <w:p>
+      <w:pPr>
+        <w:shd w:val="clear" w:color="auto" w:fill="FFFFFF"/>
+        <w:spacing w:after="0" w:line="285" w:lineRule="atLeast"/>
+        <w:rPr>
+          <w:rFonts w:ascii="Consolas" w:eastAsia="Times New Roman" w:hAnsi="Consolas" w:cs="Times New Roman"/>
+          <w:color w:val="3B3B3B"/>
+          <w:kern w:val="0"/>
+          <w:sz w:val="21"/>
+          <w:szCs w:val="21"/>
+          <w14:ligatures w14:val="none"/>
+        </w:rPr>
+      </w:pPr>
+      <w:r>
+        <w:rPr>
+          <w:rFonts w:ascii="Consolas" w:eastAsia="Times New Roman" w:hAnsi="Consolas" w:cs="Times New Roman"/>
+          <w:color w:val="000000"/>
+          <w:kern w:val="0"/>
+          <w:sz w:val="21"/>
+          <w:szCs w:val="21"/>
+          <w14:ligatures w14:val="none"/>
+        </w:rPr>
+        <w:t xml:space="preserve">    </w:t>
+      </w:r>
+      <w:r>
+        <w:rPr>
+          <w:rFonts w:ascii="Consolas" w:eastAsia="Times New Roman" w:hAnsi="Consolas" w:cs="Times New Roman"/>
+          <w:color w:val="AF00DB"/>
+          <w:kern w:val="0"/>
+          <w:sz w:val="21"/>
+          <w:szCs w:val="21"/>
+          <w14:ligatures w14:val="none"/>
+        </w:rPr>
+        <w:t>return</w:t>
+      </w:r>
+      <w:r>
+        <w:rPr>
+          <w:rFonts w:ascii="Consolas" w:eastAsia="Times New Roman" w:hAnsi="Consolas" w:cs="Times New Roman"/>
+          <w:color w:val="000000"/>
+          <w:kern w:val="0"/>
+          <w:sz w:val="21"/>
+          <w:szCs w:val="21"/>
+          <w14:ligatures w14:val="none"/>
+        </w:rPr>
+        <w:t xml:space="preserve"> </w:t>
+      </w:r>
+      <w:proofErr w:type="gramStart"/>
+      <w:r>
+        <w:rPr>
+          <w:rFonts w:ascii="Consolas" w:eastAsia="Times New Roman" w:hAnsi="Consolas" w:cs="Times New Roman"/>
+          <w:color w:val="267F99"/>
+          <w:kern w:val="0"/>
+          <w:sz w:val="21"/>
+          <w:szCs w:val="21"/>
+          <w14:ligatures w14:val="none"/>
+        </w:rPr>
+        <w:t>DateTime</w:t>
+      </w:r>
+      <w:r>
+        <w:rPr>
+          <w:rFonts w:ascii="Consolas" w:eastAsia="Times New Roman" w:hAnsi="Consolas" w:cs="Times New Roman"/>
+          <w:color w:val="000000"/>
+          <w:kern w:val="0"/>
+          <w:sz w:val="21"/>
+          <w:szCs w:val="21"/>
+          <w14:ligatures w14:val="none"/>
+        </w:rPr>
+        <w:t>::</w:t>
+      </w:r>
+      <w:r>
+        <w:rPr>
+          <w:rFonts w:ascii="Consolas" w:eastAsia="Times New Roman" w:hAnsi="Consolas" w:cs="Times New Roman"/>
+          <w:color w:val="795E26"/>
+          <w:kern w:val="0"/>
+          <w:sz w:val="21"/>
+          <w:szCs w:val="21"/>
+          <w14:ligatures w14:val="none"/>
+        </w:rPr>
+        <w:t>createFromFormat</w:t>
+      </w:r>
+      <w:r>
+        <w:rPr>
+          <w:rFonts w:ascii="Consolas" w:eastAsia="Times New Roman" w:hAnsi="Consolas" w:cs="Times New Roman"/>
+          <w:color w:val="000000"/>
+          <w:kern w:val="0"/>
+          <w:sz w:val="21"/>
+          <w:szCs w:val="21"/>
+          <w14:ligatures w14:val="none"/>
+        </w:rPr>
+        <w:t>(</w:t>
+      </w:r>
+      <w:proofErr w:type="gramEnd"/>
+      <w:r>
+        <w:rPr>
+          <w:rFonts w:ascii="Consolas" w:eastAsia="Times New Roman" w:hAnsi="Consolas" w:cs="Times New Roman"/>
+          <w:color w:val="A31515"/>
+          <w:kern w:val="0"/>
+          <w:sz w:val="21"/>
+          <w:szCs w:val="21"/>
+          <w14:ligatures w14:val="none"/>
+        </w:rPr>
+        <w:t>'</w:t>
+      </w:r>
+      <w:proofErr w:type="gramStart"/>
+      <w:r>
+        <w:rPr>
+          <w:rFonts w:ascii="Consolas" w:eastAsia="Times New Roman" w:hAnsi="Consolas" w:cs="Times New Roman"/>
+          <w:color w:val="A31515"/>
+          <w:kern w:val="0"/>
+          <w:sz w:val="21"/>
+          <w:szCs w:val="21"/>
+          <w14:ligatures w14:val="none"/>
+        </w:rPr>
+        <w:t>U.u</w:t>
+      </w:r>
+      <w:proofErr w:type="gramEnd"/>
+      <w:r>
+        <w:rPr>
+          <w:rFonts w:ascii="Consolas" w:eastAsia="Times New Roman" w:hAnsi="Consolas" w:cs="Times New Roman"/>
+          <w:color w:val="A31515"/>
+          <w:kern w:val="0"/>
+          <w:sz w:val="21"/>
+          <w:szCs w:val="21"/>
+          <w14:ligatures w14:val="none"/>
+        </w:rPr>
+        <w:t>'</w:t>
+      </w:r>
+      <w:r>
+        <w:rPr>
+          <w:rFonts w:ascii="Consolas" w:eastAsia="Times New Roman" w:hAnsi="Consolas" w:cs="Times New Roman"/>
+          <w:color w:val="000000"/>
+          <w:kern w:val="0"/>
+          <w:sz w:val="21"/>
+          <w:szCs w:val="21"/>
+          <w14:ligatures w14:val="none"/>
+        </w:rPr>
+        <w:t xml:space="preserve">, </w:t>
+      </w:r>
+      <w:r>
+        <w:rPr>
+          <w:rFonts w:ascii="Consolas" w:eastAsia="Times New Roman" w:hAnsi="Consolas" w:cs="Times New Roman"/>
+          <w:color w:val="001080"/>
+          <w:kern w:val="0"/>
+          <w:sz w:val="21"/>
+          <w:szCs w:val="21"/>
+          <w14:ligatures w14:val="none"/>
+        </w:rPr>
+        <w:t>$myStartTime</w:t>
+      </w:r>
+      <w:r>
+        <w:rPr>
+          <w:rFonts w:ascii="Consolas" w:eastAsia="Times New Roman" w:hAnsi="Consolas" w:cs="Times New Roman"/>
+          <w:color w:val="000000"/>
+          <w:kern w:val="0"/>
+          <w:sz w:val="21"/>
+          <w:szCs w:val="21"/>
+          <w14:ligatures w14:val="none"/>
+        </w:rPr>
+        <w:t>)-&gt;</w:t>
+      </w:r>
+      <w:proofErr w:type="gramStart"/>
+      <w:r>
+        <w:rPr>
+          <w:rFonts w:ascii="Consolas" w:eastAsia="Times New Roman" w:hAnsi="Consolas" w:cs="Times New Roman"/>
+          <w:color w:val="795E26"/>
+          <w:kern w:val="0"/>
+          <w:sz w:val="21"/>
+          <w:szCs w:val="21"/>
+          <w14:ligatures w14:val="none"/>
+        </w:rPr>
+        <w:t>format</w:t>
+      </w:r>
+      <w:r>
+        <w:rPr>
+          <w:rFonts w:ascii="Consolas" w:eastAsia="Times New Roman" w:hAnsi="Consolas" w:cs="Times New Roman"/>
+          <w:color w:val="000000"/>
+          <w:kern w:val="0"/>
+          <w:sz w:val="21"/>
+          <w:szCs w:val="21"/>
+          <w14:ligatures w14:val="none"/>
+        </w:rPr>
+        <w:t>(</w:t>
+      </w:r>
+      <w:proofErr w:type="gramEnd"/>
+      <w:r>
+        <w:rPr>
+          <w:rFonts w:ascii="Consolas" w:eastAsia="Times New Roman" w:hAnsi="Consolas" w:cs="Times New Roman"/>
+          <w:color w:val="A31515"/>
+          <w:kern w:val="0"/>
+          <w:sz w:val="21"/>
+          <w:szCs w:val="21"/>
+          <w14:ligatures w14:val="none"/>
+        </w:rPr>
+        <w:t>"r (u)"</w:t>
+      </w:r>
+      <w:proofErr w:type="gramStart"/>
+      <w:r>
+        <w:rPr>
+          <w:rFonts w:ascii="Consolas" w:eastAsia="Times New Roman" w:hAnsi="Consolas" w:cs="Times New Roman"/>
+          <w:color w:val="000000"/>
+          <w:kern w:val="0"/>
+          <w:sz w:val="21"/>
+          <w:szCs w:val="21"/>
+          <w14:ligatures w14:val="none"/>
+        </w:rPr>
+        <w:t>) .</w:t>
+      </w:r>
+      <w:proofErr w:type="gramEnd"/>
+      <w:r>
+        <w:rPr>
+          <w:rFonts w:ascii="Consolas" w:eastAsia="Times New Roman" w:hAnsi="Consolas" w:cs="Times New Roman"/>
+          <w:color w:val="000000"/>
+          <w:kern w:val="0"/>
+          <w:sz w:val="21"/>
+          <w:szCs w:val="21"/>
+          <w14:ligatures w14:val="none"/>
+        </w:rPr>
+        <w:t xml:space="preserve"> </w:t>
+      </w:r>
+    </w:p>
+    <w:p>
+      <w:pPr>
+        <w:shd w:val="clear" w:color="auto" w:fill="FFFFFF"/>
+        <w:spacing w:after="0" w:line="285" w:lineRule="atLeast"/>
+        <w:rPr>
+          <w:rFonts w:ascii="Consolas" w:eastAsia="Times New Roman" w:hAnsi="Consolas" w:cs="Times New Roman"/>
+          <w:color w:val="3B3B3B"/>
+          <w:kern w:val="0"/>
+          <w:sz w:val="21"/>
+          <w:szCs w:val="21"/>
+          <w14:ligatures w14:val="none"/>
+        </w:rPr>
+      </w:pPr>
+      <w:r>
+        <w:rPr>
+          <w:rFonts w:ascii="Consolas" w:eastAsia="Times New Roman" w:hAnsi="Consolas" w:cs="Times New Roman"/>
+          <w:color w:val="000000"/>
+          <w:kern w:val="0"/>
+          <w:sz w:val="21"/>
+          <w:szCs w:val="21"/>
+          <w14:ligatures w14:val="none"/>
+        </w:rPr>
+        <w:t xml:space="preserve">    </w:t>
+      </w:r>
+      <w:r>
+        <w:rPr>
+          <w:rFonts w:ascii="Consolas" w:eastAsia="Times New Roman" w:hAnsi="Consolas" w:cs="Times New Roman"/>
+          <w:color w:val="A31515"/>
+          <w:kern w:val="0"/>
+          <w:sz w:val="21"/>
+          <w:szCs w:val="21"/>
+          <w14:ligatures w14:val="none"/>
+        </w:rPr>
+        <w:t>" - "</w:t>
+      </w:r>
+      <w:r>
+        <w:rPr>
+          <w:rFonts w:ascii="Consolas" w:eastAsia="Times New Roman" w:hAnsi="Consolas" w:cs="Times New Roman"/>
+          <w:color w:val="000000"/>
+          <w:kern w:val="0"/>
+          <w:sz w:val="21"/>
+          <w:szCs w:val="21"/>
+          <w14:ligatures w14:val="none"/>
+        </w:rPr>
+        <w:t xml:space="preserve"> . </w:t>
+      </w:r>
+    </w:p>
+    <w:p>
+      <w:pPr>
+        <w:shd w:val="clear" w:color="auto" w:fill="FFFFFF"/>
+        <w:spacing w:after="0" w:line="285" w:lineRule="atLeast"/>
+        <w:rPr>
+          <w:rFonts w:ascii="Consolas" w:eastAsia="Times New Roman" w:hAnsi="Consolas" w:cs="Times New Roman"/>
+          <w:color w:val="3B3B3B"/>
+          <w:kern w:val="0"/>
+          <w:sz w:val="21"/>
+          <w:szCs w:val="21"/>
+          <w14:ligatures w14:val="none"/>
+        </w:rPr>
+      </w:pPr>
+      <w:r>
+        <w:rPr>
+          <w:rFonts w:ascii="Consolas" w:eastAsia="Times New Roman" w:hAnsi="Consolas" w:cs="Times New Roman"/>
+          <w:color w:val="000000"/>
+          <w:kern w:val="0"/>
+          <w:sz w:val="21"/>
+          <w:szCs w:val="21"/>
+          <w14:ligatures w14:val="none"/>
+        </w:rPr>
+        <w:t xml:space="preserve">    </w:t>
+      </w:r>
+      <w:proofErr w:type="gramStart"/>
+      <w:r>
+        <w:rPr>
+          <w:rFonts w:ascii="Consolas" w:eastAsia="Times New Roman" w:hAnsi="Consolas" w:cs="Times New Roman"/>
+          <w:color w:val="267F99"/>
+          <w:kern w:val="0"/>
+          <w:sz w:val="21"/>
+          <w:szCs w:val="21"/>
+          <w14:ligatures w14:val="none"/>
+        </w:rPr>
+        <w:t>DateTime</w:t>
+      </w:r>
+      <w:r>
+        <w:rPr>
+          <w:rFonts w:ascii="Consolas" w:eastAsia="Times New Roman" w:hAnsi="Consolas" w:cs="Times New Roman"/>
+          <w:color w:val="000000"/>
+          <w:kern w:val="0"/>
+          <w:sz w:val="21"/>
+          <w:szCs w:val="21"/>
+          <w14:ligatures w14:val="none"/>
+        </w:rPr>
+        <w:t>::</w:t>
+      </w:r>
+      <w:r>
+        <w:rPr>
+          <w:rFonts w:ascii="Consolas" w:eastAsia="Times New Roman" w:hAnsi="Consolas" w:cs="Times New Roman"/>
+          <w:color w:val="795E26"/>
+          <w:kern w:val="0"/>
+          <w:sz w:val="21"/>
+          <w:szCs w:val="21"/>
+          <w14:ligatures w14:val="none"/>
+        </w:rPr>
+        <w:t>createFromFormat</w:t>
+      </w:r>
+      <w:r>
+        <w:rPr>
+          <w:rFonts w:ascii="Consolas" w:eastAsia="Times New Roman" w:hAnsi="Consolas" w:cs="Times New Roman"/>
+          <w:color w:val="000000"/>
+          <w:kern w:val="0"/>
+          <w:sz w:val="21"/>
+          <w:szCs w:val="21"/>
+          <w14:ligatures w14:val="none"/>
+        </w:rPr>
+        <w:t>(</w:t>
+      </w:r>
+      <w:proofErr w:type="gramEnd"/>
+      <w:r>
+        <w:rPr>
+          <w:rFonts w:ascii="Consolas" w:eastAsia="Times New Roman" w:hAnsi="Consolas" w:cs="Times New Roman"/>
+          <w:color w:val="A31515"/>
+          <w:kern w:val="0"/>
+          <w:sz w:val="21"/>
+          <w:szCs w:val="21"/>
+          <w14:ligatures w14:val="none"/>
+        </w:rPr>
+        <w:t>'</w:t>
+      </w:r>
+      <w:proofErr w:type="gramStart"/>
+      <w:r>
+        <w:rPr>
+          <w:rFonts w:ascii="Consolas" w:eastAsia="Times New Roman" w:hAnsi="Consolas" w:cs="Times New Roman"/>
+          <w:color w:val="A31515"/>
+          <w:kern w:val="0"/>
+          <w:sz w:val="21"/>
+          <w:szCs w:val="21"/>
+          <w14:ligatures w14:val="none"/>
+        </w:rPr>
+        <w:t>U.u</w:t>
+      </w:r>
+      <w:proofErr w:type="gramEnd"/>
+      <w:r>
+        <w:rPr>
+          <w:rFonts w:ascii="Consolas" w:eastAsia="Times New Roman" w:hAnsi="Consolas" w:cs="Times New Roman"/>
+          <w:color w:val="A31515"/>
+          <w:kern w:val="0"/>
+          <w:sz w:val="21"/>
+          <w:szCs w:val="21"/>
+          <w14:ligatures w14:val="none"/>
+        </w:rPr>
+        <w:t>'</w:t>
+      </w:r>
+      <w:r>
+        <w:rPr>
+          <w:rFonts w:ascii="Consolas" w:eastAsia="Times New Roman" w:hAnsi="Consolas" w:cs="Times New Roman"/>
+          <w:color w:val="000000"/>
+          <w:kern w:val="0"/>
+          <w:sz w:val="21"/>
+          <w:szCs w:val="21"/>
+          <w14:ligatures w14:val="none"/>
+        </w:rPr>
+        <w:t xml:space="preserve">, </w:t>
+      </w:r>
+      <w:r>
+        <w:rPr>
+          <w:rFonts w:ascii="Consolas" w:eastAsia="Times New Roman" w:hAnsi="Consolas" w:cs="Times New Roman"/>
+          <w:color w:val="001080"/>
+          <w:kern w:val="0"/>
+          <w:sz w:val="21"/>
+          <w:szCs w:val="21"/>
+          <w14:ligatures w14:val="none"/>
+        </w:rPr>
+        <w:t>$myLocalStartTime</w:t>
+      </w:r>
+      <w:r>
+        <w:rPr>
+          <w:rFonts w:ascii="Consolas" w:eastAsia="Times New Roman" w:hAnsi="Consolas" w:cs="Times New Roman"/>
+          <w:color w:val="000000"/>
+          <w:kern w:val="0"/>
+          <w:sz w:val="21"/>
+          <w:szCs w:val="21"/>
+          <w14:ligatures w14:val="none"/>
+        </w:rPr>
+        <w:t>)-&gt;</w:t>
+      </w:r>
+      <w:proofErr w:type="gramStart"/>
+      <w:r>
+        <w:rPr>
+          <w:rFonts w:ascii="Consolas" w:eastAsia="Times New Roman" w:hAnsi="Consolas" w:cs="Times New Roman"/>
+          <w:color w:val="795E26"/>
+          <w:kern w:val="0"/>
+          <w:sz w:val="21"/>
+          <w:szCs w:val="21"/>
+          <w14:ligatures w14:val="none"/>
+        </w:rPr>
+        <w:t>format</w:t>
+      </w:r>
+      <w:r>
+        <w:rPr>
+          <w:rFonts w:ascii="Consolas" w:eastAsia="Times New Roman" w:hAnsi="Consolas" w:cs="Times New Roman"/>
+          <w:color w:val="000000"/>
+          <w:kern w:val="0"/>
+          <w:sz w:val="21"/>
+          <w:szCs w:val="21"/>
+          <w14:ligatures w14:val="none"/>
+        </w:rPr>
+        <w:t>(</w:t>
+      </w:r>
+      <w:proofErr w:type="gramEnd"/>
+      <w:r>
+        <w:rPr>
+          <w:rFonts w:ascii="Consolas" w:eastAsia="Times New Roman" w:hAnsi="Consolas" w:cs="Times New Roman"/>
+          <w:color w:val="A31515"/>
+          <w:kern w:val="0"/>
+          <w:sz w:val="21"/>
+          <w:szCs w:val="21"/>
+          <w14:ligatures w14:val="none"/>
+        </w:rPr>
+        <w:t>"r (u)"</w:t>
+      </w:r>
+      <w:r>
+        <w:rPr>
+          <w:rFonts w:ascii="Consolas" w:eastAsia="Times New Roman" w:hAnsi="Consolas" w:cs="Times New Roman"/>
+          <w:color w:val="000000"/>
+          <w:kern w:val="0"/>
+          <w:sz w:val="21"/>
+          <w:szCs w:val="21"/>
+          <w14:ligatures w14:val="none"/>
+        </w:rPr>
+        <w:t>);</w:t>
+      </w:r>
+    </w:p>
+    <w:p>
+      <w:pPr>
+        <w:shd w:val="clear" w:color="auto" w:fill="FFFFFF"/>
+        <w:spacing w:after="0" w:line="285" w:lineRule="atLeast"/>
+        <w:rPr>
+          <w:rFonts w:ascii="Consolas" w:eastAsia="Times New Roman" w:hAnsi="Consolas" w:cs="Times New Roman"/>
+          <w:color w:val="3B3B3B"/>
+          <w:kern w:val="0"/>
+          <w:sz w:val="21"/>
+          <w:szCs w:val="21"/>
+          <w14:ligatures w14:val="none"/>
+        </w:rPr>
+      </w:pPr>
+      <w:r>
+        <w:rPr>
+          <w:rFonts w:ascii="Consolas" w:eastAsia="Times New Roman" w:hAnsi="Consolas" w:cs="Times New Roman"/>
+          <w:color w:val="000000"/>
+          <w:kern w:val="0"/>
+          <w:sz w:val="21"/>
+          <w:szCs w:val="21"/>
+          <w14:ligatures w14:val="none"/>
+        </w:rPr>
+        <w:t>});</w:t>
+      </w:r>
+    </w:p>
+    <w:p>
+      <w:pPr>
+        <w:ind w:left="720" w:firstLine="720"/>
+        <w:rPr>
+          <w:rFonts w:ascii="Sakkal Majalla" w:hAnsi="Sakkal Majalla" w:cs="Sakkal Majalla"/>
+          <w:sz w:val="28"/>
+          <w:szCs w:val="28"/>
+        </w:rPr>
+      </w:pPr>
+      <w:r>
+        <w:rPr>
+          <w:rFonts w:ascii="Sakkal Majalla" w:hAnsi="Sakkal Majalla" w:cs="Sakkal Majalla"/>
+          <w:sz w:val="28"/>
+          <w:szCs w:val="28"/>
+        </w:rPr>
+        <w:t>*********************************************************</w:t>
+      </w:r>
+    </w:p>
+    <w:p>
+      <w:pPr>
+        <w:rPr>
+          <w:rFonts w:ascii="Sakkal Majalla" w:hAnsi="Sakkal Majalla" w:cs="Sakkal Majalla"/>
+          <w:sz w:val="28"/>
+          <w:szCs w:val="28"/>
+        </w:rPr>
+      </w:pPr>
     </w:p>
     <w:sectPr>
       <w:pgSz w:w="12240" w:h="15840"/>
@@ -2042,7 +2929,7 @@
   <w:style w:type="paragraph" w:default="1" w:styleId="Normal">
     <w:name w:val="Normal"/>
     <w:qFormat/>
-    <w:rsid w:val="00970D39"/>
+    <w:rsid w:val="005F4DB0"/>
   </w:style>
   <w:style w:type="paragraph" w:styleId="Heading1">
     <w:name w:val="heading 1"/>

</xml_diff>